<commit_message>
docs: rapport en prose continue + notes d'orateur (~15 min) dans la présentation
Remplace les listes à puces du rapport par du texte rédigé et ajoute un
script d'orateur sur les 13 diapositives, calé sur une présentation de
15 minutes (hors 5 min de questions).

Co-Authored-By: Claude Opus 4.7 <noreply@anthropic.com>
</commit_message>
<xml_diff>
--- a/Livrables/Rapport_DataCut.docx
+++ b/Livrables/Rapport_DataCut.docx
@@ -129,7 +129,6 @@
     </w:p>
     <w:p>
       <w:pPr>
-        <w:pStyle w:val="ListBullet"/>
         <w:spacing w:after="60"/>
       </w:pPr>
       <w:r>
@@ -137,14 +136,14 @@
           <w:rFonts w:ascii="Calibri" w:hAnsi="Calibri"/>
           <w:b w:val="0"/>
           <w:i w:val="0"/>
+          <w:color w:val="222222"/>
           <w:sz w:val="22"/>
         </w:rPr>
-        <w:t>1.  Introduction &amp; contexte</w:t>
+        <w:t>1. Introduction &amp; contexte</w:t>
       </w:r>
     </w:p>
     <w:p>
       <w:pPr>
-        <w:pStyle w:val="ListBullet"/>
         <w:spacing w:after="60"/>
       </w:pPr>
       <w:r>
@@ -152,14 +151,14 @@
           <w:rFonts w:ascii="Calibri" w:hAnsi="Calibri"/>
           <w:b w:val="0"/>
           <w:i w:val="0"/>
+          <w:color w:val="222222"/>
           <w:sz w:val="22"/>
         </w:rPr>
-        <w:t>2.  Architecture de la plateforme</w:t>
+        <w:t>2. Architecture de la plateforme</w:t>
       </w:r>
     </w:p>
     <w:p>
       <w:pPr>
-        <w:pStyle w:val="ListBullet"/>
         <w:spacing w:after="60"/>
       </w:pPr>
       <w:r>
@@ -167,14 +166,14 @@
           <w:rFonts w:ascii="Calibri" w:hAnsi="Calibri"/>
           <w:b w:val="0"/>
           <w:i w:val="0"/>
+          <w:color w:val="222222"/>
           <w:sz w:val="22"/>
         </w:rPr>
-        <w:t>3.  Schéma de base de données</w:t>
+        <w:t>3. Schéma de base de données</w:t>
       </w:r>
     </w:p>
     <w:p>
       <w:pPr>
-        <w:pStyle w:val="ListBullet"/>
         <w:spacing w:after="60"/>
       </w:pPr>
       <w:r>
@@ -182,14 +181,14 @@
           <w:rFonts w:ascii="Calibri" w:hAnsi="Calibri"/>
           <w:b w:val="0"/>
           <w:i w:val="0"/>
+          <w:color w:val="222222"/>
           <w:sz w:val="22"/>
         </w:rPr>
-        <w:t>4.  Pipeline de données</w:t>
+        <w:t>4. Pipeline de données</w:t>
       </w:r>
     </w:p>
     <w:p>
       <w:pPr>
-        <w:pStyle w:val="ListBullet"/>
         <w:spacing w:after="60"/>
       </w:pPr>
       <w:r>
@@ -197,14 +196,14 @@
           <w:rFonts w:ascii="Calibri" w:hAnsi="Calibri"/>
           <w:b w:val="0"/>
           <w:i w:val="0"/>
+          <w:color w:val="222222"/>
           <w:sz w:val="22"/>
         </w:rPr>
-        <w:t>5.  Extraction de features</w:t>
+        <w:t>5. Extraction de features</w:t>
       </w:r>
     </w:p>
     <w:p>
       <w:pPr>
-        <w:pStyle w:val="ListBullet"/>
         <w:spacing w:after="60"/>
       </w:pPr>
       <w:r>
@@ -212,14 +211,14 @@
           <w:rFonts w:ascii="Calibri" w:hAnsi="Calibri"/>
           <w:b w:val="0"/>
           <w:i w:val="0"/>
+          <w:color w:val="222222"/>
           <w:sz w:val="22"/>
         </w:rPr>
-        <w:t>6.  Versioning des datasets</w:t>
+        <w:t>6. Versioning des datasets</w:t>
       </w:r>
     </w:p>
     <w:p>
       <w:pPr>
-        <w:pStyle w:val="ListBullet"/>
         <w:spacing w:after="60"/>
       </w:pPr>
       <w:r>
@@ -227,14 +226,14 @@
           <w:rFonts w:ascii="Calibri" w:hAnsi="Calibri"/>
           <w:b w:val="0"/>
           <w:i w:val="0"/>
+          <w:color w:val="222222"/>
           <w:sz w:val="22"/>
         </w:rPr>
-        <w:t>7.  Entraînement du modèle</w:t>
+        <w:t>7. Entraînement du modèle</w:t>
       </w:r>
     </w:p>
     <w:p>
       <w:pPr>
-        <w:pStyle w:val="ListBullet"/>
         <w:spacing w:after="60"/>
       </w:pPr>
       <w:r>
@@ -242,14 +241,14 @@
           <w:rFonts w:ascii="Calibri" w:hAnsi="Calibri"/>
           <w:b w:val="0"/>
           <w:i w:val="0"/>
+          <w:color w:val="222222"/>
           <w:sz w:val="22"/>
         </w:rPr>
-        <w:t>8.  Visualisation &amp; supervision</w:t>
+        <w:t>8. Visualisation &amp; supervision</w:t>
       </w:r>
     </w:p>
     <w:p>
       <w:pPr>
-        <w:pStyle w:val="ListBullet"/>
         <w:spacing w:after="60"/>
       </w:pPr>
       <w:r>
@@ -257,14 +256,14 @@
           <w:rFonts w:ascii="Calibri" w:hAnsi="Calibri"/>
           <w:b w:val="0"/>
           <w:i w:val="0"/>
+          <w:color w:val="222222"/>
           <w:sz w:val="22"/>
         </w:rPr>
-        <w:t>9.  Recommandation client par IA</w:t>
+        <w:t>9. Recommandation client par IA</w:t>
       </w:r>
     </w:p>
     <w:p>
       <w:pPr>
-        <w:pStyle w:val="ListBullet"/>
         <w:spacing w:after="60"/>
       </w:pPr>
       <w:r>
@@ -272,14 +271,14 @@
           <w:rFonts w:ascii="Calibri" w:hAnsi="Calibri"/>
           <w:b w:val="0"/>
           <w:i w:val="0"/>
+          <w:color w:val="222222"/>
           <w:sz w:val="22"/>
         </w:rPr>
-        <w:t>10.  Bonnes pratiques &amp; gouvernance</w:t>
+        <w:t>10. Bonnes pratiques &amp; gouvernance</w:t>
       </w:r>
     </w:p>
     <w:p>
       <w:pPr>
-        <w:pStyle w:val="ListBullet"/>
         <w:spacing w:after="60"/>
       </w:pPr>
       <w:r>
@@ -287,9 +286,10 @@
           <w:rFonts w:ascii="Calibri" w:hAnsi="Calibri"/>
           <w:b w:val="0"/>
           <w:i w:val="0"/>
+          <w:color w:val="222222"/>
           <w:sz w:val="22"/>
         </w:rPr>
-        <w:t>11.  Conclusion &amp; perspectives</w:t>
+        <w:t>11. Conclusion &amp; perspectives</w:t>
       </w:r>
     </w:p>
     <w:p>
@@ -396,32 +396,32 @@
     </w:p>
     <w:p>
       <w:pPr>
-        <w:pStyle w:val="ListBullet"/>
-        <w:spacing w:after="60"/>
+        <w:spacing w:after="120"/>
       </w:pPr>
       <w:r>
         <w:rPr>
           <w:rFonts w:ascii="Calibri" w:hAnsi="Calibri"/>
           <w:b w:val="0"/>
           <w:i w:val="0"/>
+          <w:color w:val="222222"/>
           <w:sz w:val="22"/>
         </w:rPr>
-        <w:t>Backoffice (admin) : gestion du pipeline, labélisation, création et export de datasets versionnés, supervision via graphiques.</w:t>
+        <w:t>Le projet se décompose en deux interfaces complémentaires. Le backoffice administrateur prend en charge la gestion du pipeline, la labélisation des images, la création et l'export de datasets versionnés, ainsi que la supervision de l'ensemble via des graphiques de suivi.</w:t>
       </w:r>
     </w:p>
     <w:p>
       <w:pPr>
-        <w:pStyle w:val="ListBullet"/>
-        <w:spacing w:after="60"/>
+        <w:spacing w:after="120"/>
       </w:pPr>
       <w:r>
         <w:rPr>
           <w:rFonts w:ascii="Calibri" w:hAnsi="Calibri"/>
           <w:b w:val="0"/>
           <w:i w:val="0"/>
+          <w:color w:val="222222"/>
           <w:sz w:val="22"/>
         </w:rPr>
-        <w:t>Interface client : recommandation personnalisée de coupe par analyse IA du visage (forme et teinte de peau).</w:t>
+        <w:t>L'interface client, de son côté, propose une recommandation personnalisée de coupe : elle s'appuie sur une analyse du visage par intelligence artificielle, prenant en compte à la fois la forme du visage et la teinte de peau pour suggérer des styles adaptés.</w:t>
       </w:r>
     </w:p>
     <w:p>
@@ -925,77 +925,32 @@
     </w:p>
     <w:p>
       <w:pPr>
-        <w:pStyle w:val="ListBullet"/>
-        <w:spacing w:after="60"/>
+        <w:spacing w:after="120"/>
       </w:pPr>
       <w:r>
         <w:rPr>
           <w:rFonts w:ascii="Calibri" w:hAnsi="Calibri"/>
           <w:b w:val="0"/>
           <w:i w:val="0"/>
+          <w:color w:val="222222"/>
           <w:sz w:val="22"/>
         </w:rPr>
-        <w:t>MongoDB : flexibilité de schéma idéale pour des métadonnées hétérogènes, agrégations natives pour les statistiques de labels.</w:t>
+        <w:t>MongoDB a été retenu pour la flexibilité de son schéma, particulièrement adaptée à des métadonnées hétérogènes ; ses agrégations natives facilitent par ailleurs le calcul des statistiques de labels. NestJS apporte une architecture modulaire (GalleryModule, DatasetModule, StatsModule) qui garantit une séparation claire des responsabilités.</w:t>
       </w:r>
     </w:p>
     <w:p>
       <w:pPr>
-        <w:pStyle w:val="ListBullet"/>
-        <w:spacing w:after="60"/>
+        <w:spacing w:after="120"/>
       </w:pPr>
       <w:r>
         <w:rPr>
           <w:rFonts w:ascii="Calibri" w:hAnsi="Calibri"/>
           <w:b w:val="0"/>
           <w:i w:val="0"/>
+          <w:color w:val="222222"/>
           <w:sz w:val="22"/>
         </w:rPr>
-        <w:t>NestJS : architecture modulaire (GalleryModule, DatasetModule, StatsModule), séparation claire des responsabilités.</w:t>
-      </w:r>
-    </w:p>
-    <w:p>
-      <w:pPr>
-        <w:pStyle w:val="ListBullet"/>
-        <w:spacing w:after="60"/>
-      </w:pPr>
-      <w:r>
-        <w:rPr>
-          <w:rFonts w:ascii="Calibri" w:hAnsi="Calibri"/>
-          <w:b w:val="0"/>
-          <w:i w:val="0"/>
-          <w:sz w:val="22"/>
-        </w:rPr>
-        <w:t>sharp : extraction de features légère côté serveur, sans dépendance externe, au moment de l'upload.</w:t>
-      </w:r>
-    </w:p>
-    <w:p>
-      <w:pPr>
-        <w:pStyle w:val="ListBullet"/>
-        <w:spacing w:after="60"/>
-      </w:pPr>
-      <w:r>
-        <w:rPr>
-          <w:rFonts w:ascii="Calibri" w:hAnsi="Calibri"/>
-          <w:b w:val="0"/>
-          <w:i w:val="0"/>
-          <w:sz w:val="22"/>
-        </w:rPr>
-        <w:t>scikit-learn : implémentation éprouvée du RandomForest multi-label, adaptée à un dataset de taille limitée.</w:t>
-      </w:r>
-    </w:p>
-    <w:p>
-      <w:pPr>
-        <w:pStyle w:val="ListBullet"/>
-        <w:spacing w:after="60"/>
-      </w:pPr>
-      <w:r>
-        <w:rPr>
-          <w:rFonts w:ascii="Calibri" w:hAnsi="Calibri"/>
-          <w:b w:val="0"/>
-          <w:i w:val="0"/>
-          <w:sz w:val="22"/>
-        </w:rPr>
-        <w:t>MediaPipe : s'exécute en WebAssembly dans le navigateur, aucune donnée biométrique transmise à un serveur externe.</w:t>
+        <w:t>Pour l'extraction de features, sharp offre un traitement léger côté serveur, sans dépendance externe, déclenché au moment de l'upload. Le modèle s'appuie sur scikit-learn, qui fournit une implémentation éprouvée du RandomForest multi-label, bien adaptée à un dataset de taille limitée. Enfin, MediaPipe s'exécute en WebAssembly directement dans le navigateur, ce qui garantit qu'aucune donnée biométrique n'est transmise à un serveur externe.</w:t>
       </w:r>
     </w:p>
     <w:p>
@@ -1195,47 +1150,17 @@
     </w:p>
     <w:p>
       <w:pPr>
-        <w:pStyle w:val="ListBullet"/>
-        <w:spacing w:after="60"/>
+        <w:spacing w:after="120"/>
       </w:pPr>
       <w:r>
         <w:rPr>
           <w:rFonts w:ascii="Calibri" w:hAnsi="Calibri"/>
           <w:b w:val="0"/>
           <w:i w:val="0"/>
+          <w:color w:val="222222"/>
           <w:sz w:val="22"/>
         </w:rPr>
-        <w:t>GalleryItem.datasetVersion → DatasetVersion.version (clé logique, document store).</w:t>
-      </w:r>
-    </w:p>
-    <w:p>
-      <w:pPr>
-        <w:pStyle w:val="ListBullet"/>
-        <w:spacing w:after="60"/>
-      </w:pPr>
-      <w:r>
-        <w:rPr>
-          <w:rFonts w:ascii="Calibri" w:hAnsi="Calibri"/>
-          <w:b w:val="0"/>
-          <w:i w:val="0"/>
-          <w:sz w:val="22"/>
-        </w:rPr>
-        <w:t>DatasetVersion.imageIds liste les GalleryItem inclus dans le snapshot.</w:t>
-      </w:r>
-    </w:p>
-    <w:p>
-      <w:pPr>
-        <w:pStyle w:val="ListBullet"/>
-        <w:spacing w:after="60"/>
-      </w:pPr>
-      <w:r>
-        <w:rPr>
-          <w:rFonts w:ascii="Calibri" w:hAnsi="Calibri"/>
-          <w:b w:val="0"/>
-          <w:i w:val="0"/>
-          <w:sz w:val="22"/>
-        </w:rPr>
-        <w:t>Relation volontairement légère : les snapshots sont immuables.</w:t>
+        <w:t>La relation entre les deux collections principales reste volontairement légère, conformément à la logique d'un document store. Le champ GalleryItem.datasetVersion pointe vers DatasetVersion.version par une clé logique, tandis que le tableau DatasetVersion.imageIds liste l'ensemble des GalleryItem inclus dans le snapshot. Ce couplage souple se justifie par le caractère immuable des snapshots : une fois figée, une version ne change plus, ce qui rend inutile toute contrainte d'intégrité forte.</w:t>
       </w:r>
     </w:p>
     <w:p>
@@ -1508,47 +1433,17 @@
     </w:p>
     <w:p>
       <w:pPr>
-        <w:pStyle w:val="ListBullet"/>
-        <w:spacing w:after="60"/>
+        <w:spacing w:after="120"/>
       </w:pPr>
       <w:r>
         <w:rPr>
           <w:rFonts w:ascii="Calibri" w:hAnsi="Calibri"/>
           <w:b w:val="0"/>
           <w:i w:val="0"/>
+          <w:color w:val="222222"/>
           <w:sz w:val="22"/>
         </w:rPr>
-        <w:t>Transitions unidirectionnelles : pas de retour à un statut antérieur.</w:t>
-      </w:r>
-    </w:p>
-    <w:p>
-      <w:pPr>
-        <w:pStyle w:val="ListBullet"/>
-        <w:spacing w:after="60"/>
-      </w:pPr>
-      <w:r>
-        <w:rPr>
-          <w:rFonts w:ascii="Calibri" w:hAnsi="Calibri"/>
-          <w:b w:val="0"/>
-          <w:i w:val="0"/>
-          <w:sz w:val="22"/>
-        </w:rPr>
-        <w:t>Seules les images labeled / processed / exported sont éligibles à un dataset.</w:t>
-      </w:r>
-    </w:p>
-    <w:p>
-      <w:pPr>
-        <w:pStyle w:val="ListBullet"/>
-        <w:spacing w:after="60"/>
-      </w:pPr>
-      <w:r>
-        <w:rPr>
-          <w:rFonts w:ascii="Calibri" w:hAnsi="Calibri"/>
-          <w:b w:val="0"/>
-          <w:i w:val="0"/>
-          <w:sz w:val="22"/>
-        </w:rPr>
-        <w:t>Le funnel Pipeline visualise les volumes par statut et révèle les goulots d'étranglement.</w:t>
+        <w:t>Les transitions sont strictement unidirectionnelles : une image ne peut jamais revenir à un statut antérieur, ce qui garantit la cohérence et la traçabilité du flux. Seules les images parvenues aux statuts labeled, processed ou exported sont éligibles à l'intégration dans un dataset. Pour piloter ce processus, le funnel Pipeline visualise les volumes d'images par statut et met immédiatement en évidence les éventuels goulots d'étranglement.</w:t>
       </w:r>
     </w:p>
     <w:p>
@@ -2203,62 +2098,17 @@
     </w:p>
     <w:p>
       <w:pPr>
-        <w:pStyle w:val="ListBullet"/>
-        <w:spacing w:after="60"/>
+        <w:spacing w:after="120"/>
       </w:pPr>
       <w:r>
         <w:rPr>
           <w:rFonts w:ascii="Calibri" w:hAnsi="Calibri"/>
           <w:b w:val="0"/>
           <w:i w:val="0"/>
+          <w:color w:val="222222"/>
           <w:sz w:val="22"/>
         </w:rPr>
-        <w:t>L'administrateur clique sur « Créer une version ».</w:t>
-      </w:r>
-    </w:p>
-    <w:p>
-      <w:pPr>
-        <w:pStyle w:val="ListBullet"/>
-        <w:spacing w:after="60"/>
-      </w:pPr>
-      <w:r>
-        <w:rPr>
-          <w:rFonts w:ascii="Calibri" w:hAnsi="Calibri"/>
-          <w:b w:val="0"/>
-          <w:i w:val="0"/>
-          <w:sz w:val="22"/>
-        </w:rPr>
-        <w:t>Le backend identifie les images éligibles (labeled, processed, exported).</w:t>
-      </w:r>
-    </w:p>
-    <w:p>
-      <w:pPr>
-        <w:pStyle w:val="ListBullet"/>
-        <w:spacing w:after="60"/>
-      </w:pPr>
-      <w:r>
-        <w:rPr>
-          <w:rFonts w:ascii="Calibri" w:hAnsi="Calibri"/>
-          <w:b w:val="0"/>
-          <w:i w:val="0"/>
-          <w:sz w:val="22"/>
-        </w:rPr>
-        <w:t>Un document DatasetVersion est créé (numéro incrémental, imageIds, labelsIncluded, imageCount).</w:t>
-      </w:r>
-    </w:p>
-    <w:p>
-      <w:pPr>
-        <w:pStyle w:val="ListBullet"/>
-        <w:spacing w:after="60"/>
-      </w:pPr>
-      <w:r>
-        <w:rPr>
-          <w:rFonts w:ascii="Calibri" w:hAnsi="Calibri"/>
-          <w:b w:val="0"/>
-          <w:i w:val="0"/>
-          <w:sz w:val="22"/>
-        </w:rPr>
-        <w:t>Les images incluses passent à exported et reçoivent le tag de version.</w:t>
+        <w:t>La création d'une version suit un enchaînement simple depuis l'interface d'administration. L'administrateur déclenche l'opération via le bouton « Créer une version ». Le backend identifie alors automatiquement les images éligibles (statuts labeled, processed ou exported) et génère un document DatasetVersion comportant un numéro incrémental, la liste des imageIds, les labelsIncluded et le imageCount correspondant. Pour finir, les images ainsi capturées passent au statut exported et reçoivent le tag de la version créée, scellant définitivement leur appartenance au snapshot.</w:t>
       </w:r>
     </w:p>
     <w:p>
@@ -2851,32 +2701,17 @@
     </w:p>
     <w:p>
       <w:pPr>
-        <w:pStyle w:val="ListBullet"/>
-        <w:spacing w:after="60"/>
+        <w:spacing w:after="120"/>
       </w:pPr>
       <w:r>
         <w:rPr>
           <w:rFonts w:ascii="Calibri" w:hAnsi="Calibri"/>
           <w:b w:val="0"/>
           <w:i w:val="0"/>
+          <w:color w:val="222222"/>
           <w:sz w:val="22"/>
         </w:rPr>
-        <w:t>Graphique de croissance : nombre d'images ajoutées par semaine (8 semaines).</w:t>
-      </w:r>
-    </w:p>
-    <w:p>
-      <w:pPr>
-        <w:pStyle w:val="ListBullet"/>
-        <w:spacing w:after="60"/>
-      </w:pPr>
-      <w:r>
-        <w:rPr>
-          <w:rFonts w:ascii="Calibri" w:hAnsi="Calibri"/>
-          <w:b w:val="0"/>
-          <w:i w:val="0"/>
-          <w:sz w:val="22"/>
-        </w:rPr>
-        <w:t>Chaque version affiche : nombre d'images, labels inclus, date, export JSON direct.</w:t>
+        <w:t>Un graphique de croissance retrace le nombre d'images ajoutées semaine après semaine, sur une fenêtre de huit semaines, donnant une vision claire de la dynamique d'alimentation du dataset. En complément, chaque version est présentée avec ses indicateurs clés — nombre d'images, labels inclus et date de création — et propose un export JSON direct, facilitant la réutilisation immédiate du snapshot.</w:t>
       </w:r>
     </w:p>
     <w:p>
@@ -3575,36 +3410,6 @@
     </w:p>
     <w:p>
       <w:pPr>
-        <w:pStyle w:val="ListBullet"/>
-        <w:spacing w:after="60"/>
-      </w:pPr>
-      <w:r>
-        <w:rPr>
-          <w:rFonts w:ascii="Calibri" w:hAnsi="Calibri"/>
-          <w:b w:val="0"/>
-          <w:i w:val="0"/>
-          <w:sz w:val="22"/>
-        </w:rPr>
-        <w:t>Fichiers images → disque (/uploads/gallery/)</w:t>
-      </w:r>
-    </w:p>
-    <w:p>
-      <w:pPr>
-        <w:pStyle w:val="ListBullet"/>
-        <w:spacing w:after="60"/>
-      </w:pPr>
-      <w:r>
-        <w:rPr>
-          <w:rFonts w:ascii="Calibri" w:hAnsi="Calibri"/>
-          <w:b w:val="0"/>
-          <w:i w:val="0"/>
-          <w:sz w:val="22"/>
-        </w:rPr>
-        <w:t>Métadonnées → MongoDB (statut, labels, features, références)</w:t>
-      </w:r>
-    </w:p>
-    <w:p>
-      <w:pPr>
         <w:spacing w:after="120"/>
       </w:pPr>
       <w:r>
@@ -3615,7 +3420,7 @@
           <w:color w:val="222222"/>
           <w:sz w:val="22"/>
         </w:rPr>
-        <w:t>Cette séparation permet de migrer vers S3 ou un CDN sans toucher à la base de données.</w:t>
+        <w:t>L'architecture distingue nettement le stockage des fichiers de celui des métadonnées : les images sont déposées sur le disque (/uploads/gallery/), tandis que MongoDB conserve l'ensemble des métadonnées associées — statut, labels, features et références. Cette séparation offre une grande souplesse d'évolution : il devient possible de migrer le stockage vers un service S3 ou un CDN sans avoir à modifier la base de données ni la logique métier.</w:t>
       </w:r>
     </w:p>
     <w:p>
@@ -3661,47 +3466,17 @@
     </w:p>
     <w:p>
       <w:pPr>
-        <w:pStyle w:val="ListBullet"/>
-        <w:spacing w:after="60"/>
+        <w:spacing w:after="120"/>
       </w:pPr>
       <w:r>
         <w:rPr>
           <w:rFonts w:ascii="Calibri" w:hAnsi="Calibri"/>
           <w:b w:val="0"/>
           <w:i w:val="0"/>
+          <w:color w:val="222222"/>
           <w:sz w:val="22"/>
         </w:rPr>
-        <w:t>Authentification JWT, rôles client / admin, OAuth2 Google.</w:t>
-      </w:r>
-    </w:p>
-    <w:p>
-      <w:pPr>
-        <w:pStyle w:val="ListBullet"/>
-        <w:spacing w:after="60"/>
-      </w:pPr>
-      <w:r>
-        <w:rPr>
-          <w:rFonts w:ascii="Calibri" w:hAnsi="Calibri"/>
-          <w:b w:val="0"/>
-          <w:i w:val="0"/>
-          <w:sz w:val="22"/>
-        </w:rPr>
-        <w:t>Guards NestJS sur toutes les routes sensibles.</w:t>
-      </w:r>
-    </w:p>
-    <w:p>
-      <w:pPr>
-        <w:pStyle w:val="ListBullet"/>
-        <w:spacing w:after="60"/>
-      </w:pPr>
-      <w:r>
-        <w:rPr>
-          <w:rFonts w:ascii="Calibri" w:hAnsi="Calibri"/>
-          <w:b w:val="0"/>
-          <w:i w:val="0"/>
-          <w:sz w:val="22"/>
-        </w:rPr>
-        <w:t>MediaPipe in-browser : aucune donnée biométrique transmise (RGPD by design).</w:t>
+        <w:t>La sécurité repose sur une authentification par JWT, complétée par une connexion OAuth2 Google, avec une distinction des rôles entre client et administrateur. Toutes les routes sensibles sont protégées par des Guards NestJS, qui contrôlent systématiquement les droits d'accès. Sur le plan de la protection des données personnelles, l'analyse du visage par MediaPipe s'exécute intégralement dans le navigateur : aucune donnée biométrique n'est transmise à un serveur, ce qui inscrit la solution dans une logique de respect du RGPD dès la conception (privacy by design).</w:t>
       </w:r>
     </w:p>
     <w:p>
@@ -4096,77 +3871,32 @@
     </w:p>
     <w:p>
       <w:pPr>
-        <w:pStyle w:val="ListBullet"/>
-        <w:spacing w:after="60"/>
+        <w:spacing w:after="120"/>
       </w:pPr>
       <w:r>
         <w:rPr>
           <w:rFonts w:ascii="Calibri" w:hAnsi="Calibri"/>
           <w:b w:val="0"/>
           <w:i w:val="0"/>
+          <w:color w:val="222222"/>
           <w:sz w:val="22"/>
         </w:rPr>
-        <w:t>Dataset plus volumineux (objectif : 100+ images par label).</w:t>
+        <w:t>Plusieurs axes d'évolution se dégagent naturellement de ce travail. Le premier consisterait à constituer un dataset nettement plus volumineux, avec un objectif d'au moins une centaine d'images par label, afin d'améliorer significativement les performances du modèle. En parallèle, le passage à un stockage cloud (AWS S3 ou Cloudinary) renforcerait la scalabilité de la plateforme.</w:t>
       </w:r>
     </w:p>
     <w:p>
       <w:pPr>
-        <w:pStyle w:val="ListBullet"/>
-        <w:spacing w:after="60"/>
+        <w:spacing w:after="120"/>
       </w:pPr>
       <w:r>
         <w:rPr>
           <w:rFonts w:ascii="Calibri" w:hAnsi="Calibri"/>
           <w:b w:val="0"/>
           <w:i w:val="0"/>
+          <w:color w:val="222222"/>
           <w:sz w:val="22"/>
         </w:rPr>
-        <w:t>Stockage cloud (AWS S3, Cloudinary).</w:t>
-      </w:r>
-    </w:p>
-    <w:p>
-      <w:pPr>
-        <w:pStyle w:val="ListBullet"/>
-        <w:spacing w:after="60"/>
-      </w:pPr>
-      <w:r>
-        <w:rPr>
-          <w:rFonts w:ascii="Calibri" w:hAnsi="Calibri"/>
-          <w:b w:val="0"/>
-          <w:i w:val="0"/>
-          <w:sz w:val="22"/>
-        </w:rPr>
-        <w:t>API de prédiction temps réel exposant model.pkl.</w:t>
-      </w:r>
-    </w:p>
-    <w:p>
-      <w:pPr>
-        <w:pStyle w:val="ListBullet"/>
-        <w:spacing w:after="60"/>
-      </w:pPr>
-      <w:r>
-        <w:rPr>
-          <w:rFonts w:ascii="Calibri" w:hAnsi="Calibri"/>
-          <w:b w:val="0"/>
-          <w:i w:val="0"/>
-          <w:sz w:val="22"/>
-        </w:rPr>
-        <w:t>Réentraînement automatique déclenché par un nouveau dataset.</w:t>
-      </w:r>
-    </w:p>
-    <w:p>
-      <w:pPr>
-        <w:pStyle w:val="ListBullet"/>
-        <w:spacing w:after="60"/>
-      </w:pPr>
-      <w:r>
-        <w:rPr>
-          <w:rFonts w:ascii="Calibri" w:hAnsi="Calibri"/>
-          <w:b w:val="0"/>
-          <w:i w:val="0"/>
-          <w:sz w:val="22"/>
-        </w:rPr>
-        <w:t>CNN / Vision Transformer pour remplacer le RandomForest.</w:t>
+        <w:t>Sur le plan applicatif, l'exposition de model.pkl via une API de prédiction en temps réel permettrait d'intégrer directement les recommandations dans le parcours client, tandis qu'un réentraînement automatique déclenché à chaque nouveau dataset rendrait le système véritablement continu. Enfin, à plus long terme, le remplacement du RandomForest par une architecture de type CNN ou Vision Transformer ouvrirait la voie à une analyse fine du contenu visuel des images plutôt que de leurs seules caractéristiques globales.</w:t>
       </w:r>
     </w:p>
     <w:sectPr>

</xml_diff>